<commit_message>
Cover letter v3.1: restore Recommended Reviewers block verbatim; supplementary range now Tables S1-S17
</commit_message>
<xml_diff>
--- a/cover_letter_v3.1.docx
+++ b/cover_letter_v3.1.docx
@@ -12,7 +12,7 @@
           <w:b w:val="0"/>
           <w:i w:val="0"/>
           <w:color w:val="000000"/>
-          <w:sz w:val="20"/>
+          <w:sz w:val="19"/>
         </w:rPr>
         <w:t>Date: 22 October 2026</w:t>
       </w:r>
@@ -27,7 +27,7 @@
           <w:b w:val="0"/>
           <w:i w:val="0"/>
           <w:color w:val="000000"/>
-          <w:sz w:val="20"/>
+          <w:sz w:val="19"/>
         </w:rPr>
         <w:t>To: The Editor, Nucleic Acids Research, Oxford University Press</w:t>
       </w:r>
@@ -42,7 +42,7 @@
           <w:b w:val="0"/>
           <w:i w:val="0"/>
           <w:color w:val="000000"/>
-          <w:sz w:val="20"/>
+          <w:sz w:val="19"/>
         </w:rPr>
         <w:t>Re: Submission of a Methods Article</w:t>
       </w:r>
@@ -57,7 +57,7 @@
           <w:b/>
           <w:i w:val="0"/>
           <w:color w:val="000000"/>
-          <w:sz w:val="20"/>
+          <w:sz w:val="19"/>
         </w:rPr>
         <w:t>Title: Fusang: Tardigrade Edition — K-mer Frequency Vector Alignment-Free Phylogenetic Inference Resilient to Indel-Rich Sequence Evolution</w:t>
       </w:r>
@@ -72,7 +72,7 @@
           <w:b w:val="0"/>
           <w:i w:val="0"/>
           <w:color w:val="000000"/>
-          <w:sz w:val="20"/>
+          <w:sz w:val="19"/>
         </w:rPr>
         <w:t>Dear Editor,</w:t>
       </w:r>
@@ -87,7 +87,7 @@
           <w:b w:val="0"/>
           <w:i w:val="0"/>
           <w:color w:val="000000"/>
-          <w:sz w:val="20"/>
+          <w:sz w:val="19"/>
         </w:rPr>
         <w:t>We submit the above manuscript for consideration as a Methods Article in Nucleic Acids Research. It is a systematic evaluation of k-mer frequency vector cosine distances — spaced and contiguous patterns — for phylogenetic inference under indel-rich sequence evolution, delivered as open-source software (Fusang: Tardigrade Edition) with automatic parameter selection, a multi-k ensemble requiring no manual choice of k, and an empirically delimited domain of applicability. Three findings are of principal interest:</w:t>
       </w:r>
@@ -102,7 +102,7 @@
           <w:b/>
           <w:i w:val="0"/>
           <w:color w:val="000000"/>
-          <w:sz w:val="20"/>
+          <w:sz w:val="19"/>
         </w:rPr>
         <w:t>1. Indel robustness is real but rate-dependent, and we locate the crossover.</w:t>
       </w:r>
@@ -117,7 +117,7 @@
           <w:b w:val="0"/>
           <w:i w:val="0"/>
           <w:color w:val="000000"/>
-          <w:sz w:val="20"/>
+          <w:sz w:val="19"/>
         </w:rPr>
         <w:t>On INDELible-simulated gene-length data (n=200, L=500 bp, 130 independent seeds, scored against the true tree), Fusang's accuracy relative to MAFFT+FastTree2 improves monotonically with indel rate and crosses zero between 0.01 and 0.02: it is significantly worse at 0.005 (−8.9%, p=1.75×10⁻¹¹) and at 0.01 (−5.1%, p=5.20×10⁻⁵), numerically but not significantly better at 0.02 (nRF 0.199 ± 0.030 vs 0.205 ± 0.030, p=0.0507), and clearly better at 0.05 (+10.9%; 0.180 vs 0.202, p=1.27×10⁻¹¹, better in 99/130 seeds). The advantage is concentrated at high indel density, and we report it as such.</w:t>
       </w:r>
@@ -132,7 +132,7 @@
           <w:b/>
           <w:i w:val="0"/>
           <w:color w:val="000000"/>
-          <w:sz w:val="20"/>
+          <w:sz w:val="19"/>
         </w:rPr>
         <w:t>2. The multi-k ensemble removes manual k selection and is the most accurate configuration we tested at gene length.</w:t>
       </w:r>
@@ -147,7 +147,7 @@
           <w:b w:val="0"/>
           <w:i w:val="0"/>
           <w:color w:val="000000"/>
-          <w:sz w:val="20"/>
+          <w:sz w:val="19"/>
         </w:rPr>
         <w:t>On the same 130-seed benchmark the ensemble (contiguous k=5/7/9 averaged) attains nRF=0.1940 against 0.1990 for the default spaced-k plus NNI pipeline (p=7.7×10⁻³, better in 72/130 seeds), while tying the best single k (contiguous k=7, 0.1938; p=0.669). Under an independent 30-seed protocol at L=1000 bp, multi-k fusion cuts error by 8.7% relative to single-k (0.137 vs 0.150, p=0.00206), reaching within ~11% relative error of MAFFT+FastTree2 (0.124) with no alignment step. On real indel-rich data — 25 fish mitochondrial genomes, 9.1% gap cells in the alignment — multi-k cosine reaches nRF=0.045, identical to MAFFT+FastTree2 and to the best published alignment-free configurations, where the gene-scale default (k=5) saturates at 0.545.</w:t>
       </w:r>
@@ -162,7 +162,7 @@
           <w:b/>
           <w:i w:val="0"/>
           <w:color w:val="000000"/>
-          <w:sz w:val="20"/>
+          <w:sz w:val="19"/>
         </w:rPr>
         <w:t>3. “Alignment-free” is not one category, and we map its boundaries.</w:t>
       </w:r>
@@ -177,7 +177,7 @@
           <w:b w:val="0"/>
           <w:i w:val="0"/>
           <w:color w:val="000000"/>
-          <w:sz w:val="20"/>
+          <w:sz w:val="19"/>
         </w:rPr>
         <w:t>At gene length (L=500 bp) MinHash Jaccard (Mash, k=21) is far less accurate than k-mer cosine in both conditions (clean 0.3486 vs 0.2364, paired d=3.12; indel 0.4034 vs 0.1926, d=2.61; Fusang better in 30/30 seeds in both), and the two respond to indels in opposite directions (Mash degrades 1.16× while k-mer cosine improves 0.83×). We also state where k-mer cosine should not be preferred: strain-level bacterial genomes (E. coli/Shigella, plateau nRF=0.500) and structurally conserved RNA genes.</w:t>
       </w:r>
@@ -192,14 +192,14 @@
           <w:b/>
           <w:i w:val="0"/>
           <w:color w:val="000000"/>
-          <w:sz w:val="20"/>
+          <w:sz w:val="19"/>
         </w:rPr>
         <w:t>Transparency.</w:t>
       </w:r>
     </w:p>
     <w:p>
       <w:pPr>
-        <w:spacing w:after="120" w:before="0" w:line="240" w:lineRule="auto"/>
+        <w:spacing w:after="100" w:before="0" w:line="240" w:lineRule="auto"/>
       </w:pPr>
       <w:r>
         <w:rPr>
@@ -207,9 +207,99 @@
           <w:b w:val="0"/>
           <w:i w:val="0"/>
           <w:color w:val="000000"/>
-          <w:sz w:val="20"/>
+          <w:sz w:val="19"/>
         </w:rPr>
         <w:t>This version supersedes values carried by earlier iterations of the work — data from a coalescent simulator we regard as defective, and figures from a root-dependent RF implementation — and states on its face which claims are withdrawn or reversed. All accuracy figures use the standard root-independent unrooted RF (RF/2(n−3)), with Wilcoxon signed-rank tests on integer RF counts.</w:t>
+      </w:r>
+    </w:p>
+    <w:p>
+      <w:pPr>
+        <w:spacing w:after="20" w:before="0" w:line="240" w:lineRule="auto"/>
+      </w:pPr>
+      <w:r>
+        <w:rPr>
+          <w:rFonts w:ascii="Times New Roman" w:hAnsi="Times New Roman" w:eastAsia="Times New Roman" w:cs="Times New Roman"/>
+          <w:b/>
+          <w:i w:val="0"/>
+          <w:color w:val="000000"/>
+          <w:sz w:val="19"/>
+        </w:rPr>
+        <w:t>Recommended Reviewers</w:t>
+      </w:r>
+    </w:p>
+    <w:p>
+      <w:pPr>
+        <w:spacing w:after="20" w:before="0" w:line="240" w:lineRule="auto"/>
+      </w:pPr>
+      <w:r>
+        <w:rPr>
+          <w:rFonts w:ascii="Times New Roman" w:hAnsi="Times New Roman" w:eastAsia="Times New Roman" w:cs="Times New Roman"/>
+          <w:b w:val="0"/>
+          <w:i w:val="0"/>
+          <w:color w:val="000000"/>
+          <w:sz w:val="19"/>
+        </w:rPr>
+        <w:t>We suggest the following researchers as potential reviewers (please note that we have avoided suggesting direct collaborators):</w:t>
+      </w:r>
+    </w:p>
+    <w:p>
+      <w:pPr>
+        <w:spacing w:after="0" w:before="0" w:line="240" w:lineRule="auto"/>
+      </w:pPr>
+      <w:r>
+        <w:rPr>
+          <w:rFonts w:ascii="Times New Roman" w:hAnsi="Times New Roman" w:eastAsia="Times New Roman" w:cs="Times New Roman"/>
+          <w:b w:val="0"/>
+          <w:i w:val="0"/>
+          <w:color w:val="000000"/>
+          <w:sz w:val="19"/>
+        </w:rPr>
+        <w:t>Dr. Bernard Haubold (Max Planck Institute for Chemical Ecology) — developer of andi, a suffix array-based alignment-free method.</w:t>
+      </w:r>
+    </w:p>
+    <w:p>
+      <w:pPr>
+        <w:spacing w:after="0" w:before="0" w:line="240" w:lineRule="auto"/>
+      </w:pPr>
+      <w:r>
+        <w:rPr>
+          <w:rFonts w:ascii="Times New Roman" w:hAnsi="Times New Roman" w:eastAsia="Times New Roman" w:cs="Times New Roman"/>
+          <w:b w:val="0"/>
+          <w:i w:val="0"/>
+          <w:color w:val="000000"/>
+          <w:sz w:val="19"/>
+        </w:rPr>
+        <w:t>Dr. Olga Vekshina (University of Texas) — expert in alignment-free phylogenetics and spaced seed design.</w:t>
+      </w:r>
+    </w:p>
+    <w:p>
+      <w:pPr>
+        <w:spacing w:after="0" w:before="0" w:line="240" w:lineRule="auto"/>
+      </w:pPr>
+      <w:r>
+        <w:rPr>
+          <w:rFonts w:ascii="Times New Roman" w:hAnsi="Times New Roman" w:eastAsia="Times New Roman" w:cs="Times New Roman"/>
+          <w:b w:val="0"/>
+          <w:i w:val="0"/>
+          <w:color w:val="000000"/>
+          <w:sz w:val="19"/>
+        </w:rPr>
+        <w:t>Dr. Daniel Huson (University of Tübingen) — developer of SplitsTree and contributor to disk-covering methods.</w:t>
+      </w:r>
+    </w:p>
+    <w:p>
+      <w:pPr>
+        <w:spacing w:after="100" w:before="0" w:line="240" w:lineRule="auto"/>
+      </w:pPr>
+      <w:r>
+        <w:rPr>
+          <w:rFonts w:ascii="Times New Roman" w:hAnsi="Times New Roman" w:eastAsia="Times New Roman" w:cs="Times New Roman"/>
+          <w:b w:val="0"/>
+          <w:i w:val="0"/>
+          <w:color w:val="000000"/>
+          <w:sz w:val="19"/>
+        </w:rPr>
+        <w:t>Dr. Rob Knight (University of California, San Diego) — expert in microbiome phylogenetic analysis and alignment-free methods.</w:t>
       </w:r>
     </w:p>
     <w:p>
@@ -222,7 +312,7 @@
           <w:b/>
           <w:i w:val="0"/>
           <w:color w:val="000000"/>
-          <w:sz w:val="20"/>
+          <w:sz w:val="19"/>
         </w:rPr>
         <w:t>Software and data availability.</w:t>
       </w:r>
@@ -237,9 +327,9 @@
           <w:b w:val="0"/>
           <w:i w:val="0"/>
           <w:color w:val="000000"/>
-          <w:sz w:val="20"/>
+          <w:sz w:val="19"/>
         </w:rPr>
-        <w:t>Fusang: Tardigrade Edition is released under the MIT license with pre-compiled FastME binaries (Windows/Linux x86-64), benchmark scripts and analysis code at https://github.com/zhanglknt/fusang-tardigrade, archived at https://doi.org/10.5281/zenodo.20746742. All benchmark datasets — the 130-seed n=200 indel results, the n=500 and n=1,000 multi-seed data, the 30-seed Linux MAFFT+FastTree2 comparison, the Mash, kmacs and Skmer runs, the AFproject real-genome benchmarks, the 150-scenario classifier validation, the 73-taxon 16S rRNA dataset and the BAliBASE v3.0 results — are in the repository and as Supplementary Data. Inference on 10,000 taxa completes in 69.8 s with peak memory below 1 GB.</w:t>
+        <w:t>Fusang: Tardigrade Edition is released under the MIT license with pre-compiled FastME binaries (Windows/Linux x86-64), benchmark scripts and analysis code at https://github.com/zhanglknt/fusang-tardigrade, archived at https://doi.org/10.5281/zenodo.20746742. All benchmark datasets — the 130-seed n=200 indel results, the n=500 and n=1,000 multi-seed data, the 30-seed Linux MAFFT+FastTree2 comparison, the Mash, kmacs and Skmer runs, the AFproject real-genome benchmarks, the 150-scenario classifier validation, the 73-taxon 16S rRNA dataset and the BAliBASE v3.0 results — are in the repository and as Supplementary Data (Supplementary Tables S1–S17). Inference on 10,000 taxa completes in 69.8 s with peak memory below 1 GB.</w:t>
       </w:r>
     </w:p>
     <w:p>
@@ -252,7 +342,7 @@
           <w:b w:val="0"/>
           <w:i w:val="0"/>
           <w:color w:val="000000"/>
-          <w:sz w:val="20"/>
+          <w:sz w:val="19"/>
         </w:rPr>
         <w:t>No competing interests are declared. Support: National Natural Science Foundation of China (32370682) and the Prevention and Control of Emerging and Major Infectious Diseases — National Science and Technology Major Project (2026ZD01910500).</w:t>
       </w:r>
@@ -267,7 +357,7 @@
           <w:b w:val="0"/>
           <w:i w:val="0"/>
           <w:color w:val="000000"/>
-          <w:sz w:val="20"/>
+          <w:sz w:val="19"/>
         </w:rPr>
         <w:t>We confirm that this manuscript has not been published elsewhere and is not under consideration by any other journal, and that all authors have read and approved it.</w:t>
       </w:r>
@@ -282,7 +372,7 @@
           <w:b w:val="0"/>
           <w:i w:val="0"/>
           <w:color w:val="000000"/>
-          <w:sz w:val="20"/>
+          <w:sz w:val="19"/>
         </w:rPr>
         <w:t>Sincerely,</w:t>
       </w:r>
@@ -297,7 +387,7 @@
           <w:b w:val="0"/>
           <w:i w:val="0"/>
           <w:color w:val="000000"/>
-          <w:sz w:val="20"/>
+          <w:sz w:val="19"/>
         </w:rPr>
         <w:t>Li Zhang, Ph.D. — corresponding author, on behalf of all authors (first author: Lei Kong).</w:t>
       </w:r>
@@ -312,14 +402,14 @@
           <w:b w:val="0"/>
           <w:i w:val="0"/>
           <w:color w:val="000000"/>
-          <w:sz w:val="20"/>
+          <w:sz w:val="19"/>
         </w:rPr>
         <w:t>Institute of Blood Transfusion, Chinese Academy of Medical Sciences and Peking Union Medical College; 26 Huacai Road, Longtan Industrial Park, Chenghua District, Chengdu 610052, Sichuan, China. Email: knightz@pumc.edu.cn</w:t>
       </w:r>
     </w:p>
     <w:sectPr>
       <w:pgSz w:w="12240" w:h="15840"/>
-      <w:pgMar w:top="907" w:right="1134" w:bottom="907" w:left="1134" w:header="720" w:footer="720" w:gutter="0"/>
+      <w:pgMar w:top="794" w:right="1020" w:bottom="794" w:left="1020" w:header="720" w:footer="720" w:gutter="0"/>
       <w:cols w:space="720"/>
       <w:docGrid w:linePitch="360"/>
     </w:sectPr>
@@ -692,7 +782,7 @@
     <w:rsid w:val="00FC693F"/>
     <w:rPr>
       <w:rFonts w:ascii="Times New Roman" w:hAnsi="Times New Roman"/>
-      <w:sz w:val="20"/>
+      <w:sz w:val="19"/>
     </w:rPr>
   </w:style>
   <w:style w:type="paragraph" w:styleId="Header">

</xml_diff>